<commit_message>
Translate bundled SDK source comments
</commit_message>
<xml_diff>
--- a/Server/NewServer/3rd/oasdk_1.5.7/Server/linux/samples/java/OA-JAVA-SDK-docs.docx
+++ b/Server/NewServer/3rd/oasdk_1.5.7/Server/linux/samples/java/OA-JAVA-SDK-docs.docx
@@ -15,7 +15,7 @@
         <w:rPr>
           <w:rFonts w:hint="eastAsia"/>
         </w:rPr>
-        <w:t>环境要求以及程序配置</w:t>
+        <w:t>Environment and program configuration</w:t>
       </w:r>
     </w:p>
     <w:p>
@@ -37,7 +37,7 @@
         <w:rPr>
           <w:rFonts w:hint="eastAsia"/>
         </w:rPr>
-        <w:t>或者以上</w:t>
+        <w:t xml:space="preserve"> or later</w:t>
       </w:r>
     </w:p>
     <w:p>
@@ -62,7 +62,7 @@
         <w:rPr>
           <w:rFonts w:hint="eastAsia"/>
         </w:rPr>
-        <w:t>的</w:t>
+        <w:t xml:space="preserve"> </w:t>
       </w:r>
       <w:r>
         <w:rPr>
@@ -74,7 +74,7 @@
         <w:rPr>
           <w:rFonts w:hint="eastAsia"/>
         </w:rPr>
-        <w:t>位操作系统</w:t>
+        <w:t>-bit operating system</w:t>
       </w:r>
     </w:p>
     <w:p>
@@ -90,7 +90,7 @@
         <w:rPr>
           <w:rFonts w:hint="eastAsia"/>
         </w:rPr>
-        <w:t>增加系统启动参数</w:t>
+        <w:t xml:space="preserve">Add the startup parameter </w:t>
       </w:r>
       <w:r>
         <w:rPr>
@@ -102,7 +102,7 @@
         <w:rPr>
           <w:rFonts w:hint="eastAsia"/>
         </w:rPr>
-        <w:t>如果不设置</w:t>
+        <w:t>If unset</w:t>
       </w:r>
       <w:r>
         <w:rPr>
@@ -114,7 +114,7 @@
         <w:rPr>
           <w:rFonts w:hint="eastAsia"/>
         </w:rPr>
-        <w:t>默认是程序当前的工作路径</w:t>
+        <w:t xml:space="preserve"> the default is the current working directory</w:t>
       </w:r>
       <w:r>
         <w:rPr>
@@ -126,7 +126,7 @@
         <w:rPr>
           <w:rFonts w:hint="eastAsia"/>
         </w:rPr>
-        <w:t>比如</w:t>
+        <w:t xml:space="preserve"> for example</w:t>
       </w:r>
       <w:r>
         <w:rPr>
@@ -156,7 +156,7 @@
         <w:rPr>
           <w:rFonts w:hint="eastAsia"/>
         </w:rPr>
-        <w:t>动态库</w:t>
+        <w:t>Native library</w:t>
       </w:r>
       <w:r>
         <w:rPr>
@@ -168,7 +168,7 @@
         <w:rPr>
           <w:rFonts w:hint="eastAsia"/>
         </w:rPr>
-        <w:t>把</w:t>
+        <w:t xml:space="preserve">Place </w:t>
       </w:r>
       <w:r>
         <w:t>OANativeClient.dll</w:t>
@@ -192,7 +192,7 @@
         <w:rPr>
           <w:rFonts w:hint="eastAsia"/>
         </w:rPr>
-        <w:t>放入</w:t>
+        <w:t xml:space="preserve"> in </w:t>
       </w:r>
       <w:r>
         <w:rPr>
@@ -204,7 +204,7 @@
         <w:rPr>
           <w:rFonts w:hint="eastAsia"/>
         </w:rPr>
-        <w:t>下面</w:t>
+        <w:t/>
       </w:r>
     </w:p>
     <w:p>
@@ -216,7 +216,7 @@
         <w:rPr>
           <w:rFonts w:hint="eastAsia"/>
         </w:rPr>
-        <w:t>配置文件</w:t>
+        <w:t>Configuration file</w:t>
       </w:r>
       <w:r>
         <w:rPr>
@@ -228,7 +228,7 @@
         <w:rPr>
           <w:rFonts w:hint="eastAsia"/>
         </w:rPr>
-        <w:t>把配置文件</w:t>
+        <w:t xml:space="preserve">Place the configuration file </w:t>
       </w:r>
       <w:r>
         <w:t>sdoa4server.ini</w:t>
@@ -243,7 +243,7 @@
         <w:rPr>
           <w:rFonts w:hint="eastAsia"/>
         </w:rPr>
-        <w:t>放入</w:t>
+        <w:t xml:space="preserve"> in </w:t>
       </w:r>
       <w:r>
         <w:rPr>
@@ -255,7 +255,7 @@
         <w:rPr>
           <w:rFonts w:hint="eastAsia"/>
         </w:rPr>
-        <w:t>下面</w:t>
+        <w:t/>
       </w:r>
     </w:p>
     <w:p>
@@ -271,7 +271,7 @@
         <w:rPr>
           <w:rFonts w:hint="eastAsia"/>
         </w:rPr>
-        <w:t>第三方类库依赖</w:t>
+        <w:t>Third-party dependency</w:t>
       </w:r>
       <w:r>
         <w:rPr>
@@ -299,7 +299,7 @@
         <w:rPr>
           <w:rFonts w:hint="eastAsia"/>
         </w:rPr>
-        <w:t>订单请求</w:t>
+        <w:t xml:space="preserve">Order request </w:t>
       </w:r>
       <w:r>
         <w:rPr>
@@ -311,7 +311,7 @@
         <w:rPr>
           <w:rFonts w:hint="eastAsia"/>
         </w:rPr>
-        <w:t>相关的代码</w:t>
+        <w:t xml:space="preserve"> code</w:t>
       </w:r>
     </w:p>
     <w:p>
@@ -359,7 +359,7 @@
                       <w:sz w:val="20"/>
                       <w:szCs w:val="20"/>
                     </w:rPr>
-                    <w:t>可以采用单实例</w:t>
+                    <w:t>A single instance may be used</w:t>
                   </w:r>
                   <w:r>
                     <w:rPr>
@@ -379,7 +379,7 @@
                       <w:sz w:val="20"/>
                       <w:szCs w:val="20"/>
                     </w:rPr>
-                    <w:t>该类线程安全</w:t>
+                    <w:t xml:space="preserve"> the class is thread-safe</w:t>
                   </w:r>
                 </w:p>
                 <w:p>
@@ -475,7 +475,7 @@
                       <w:sz w:val="20"/>
                       <w:szCs w:val="20"/>
                     </w:rPr>
-                    <w:t>创建</w:t>
+                    <w:t xml:space="preserve">Create </w:t>
                   </w:r>
                   <w:r>
                     <w:rPr>
@@ -485,7 +485,7 @@
                       <w:sz w:val="20"/>
                       <w:szCs w:val="20"/>
                     </w:rPr>
-                    <w:t>扣费的订单</w:t>
+                    <w:t>a payment order</w:t>
                   </w:r>
                   <w:r>
                     <w:rPr>
@@ -505,7 +505,7 @@
                       <w:sz w:val="20"/>
                       <w:szCs w:val="20"/>
                     </w:rPr>
-                    <w:t>相关的订单请用相关的</w:t>
+                    <w:t xml:space="preserve">instantiate the appropriate </w:t>
                   </w:r>
                   <w:r>
                     <w:rPr>
@@ -525,7 +525,7 @@
                       <w:sz w:val="20"/>
                       <w:szCs w:val="20"/>
                     </w:rPr>
-                    <w:t>类实例化</w:t>
+                    <w:t xml:space="preserve"> class for other orders</w:t>
                   </w:r>
                   <w:r>
                     <w:rPr>
@@ -660,7 +660,7 @@
                       <w:sz w:val="20"/>
                       <w:szCs w:val="20"/>
                     </w:rPr>
-                    <w:t>对订单信息进行传值</w:t>
+                    <w:t>Set order fields</w:t>
                   </w:r>
                   <w:r>
                     <w:rPr>
@@ -680,7 +680,7 @@
                       <w:sz w:val="20"/>
                       <w:szCs w:val="20"/>
                     </w:rPr>
-                    <w:t>以下只是简单的设置</w:t>
+                    <w:t xml:space="preserve"> this is only a basic example </w:t>
                   </w:r>
                   <w:r>
                     <w:rPr>
@@ -690,7 +690,7 @@
                       <w:sz w:val="20"/>
                       <w:szCs w:val="20"/>
                     </w:rPr>
-                    <w:t>字段并不全面</w:t>
+                    <w:t>and does not cover every field</w:t>
                   </w:r>
                   <w:r>
                     <w:rPr>
@@ -710,7 +710,7 @@
                       <w:sz w:val="20"/>
                       <w:szCs w:val="20"/>
                     </w:rPr>
-                    <w:t>相关的字段设置请参阅协议文档</w:t>
+                    <w:t xml:space="preserve"> see the protocol documentation for field details</w:t>
                   </w:r>
                 </w:p>
                 <w:p>
@@ -1081,7 +1081,7 @@
                       <w:sz w:val="20"/>
                       <w:szCs w:val="20"/>
                     </w:rPr>
-                    <w:t>生成订单请求的</w:t>
+                    <w:t xml:space="preserve">Generate the order request </w:t>
                   </w:r>
                   <w:r>
                     <w:rPr>
@@ -1099,7 +1099,7 @@
                       <w:sz w:val="20"/>
                       <w:szCs w:val="20"/>
                     </w:rPr>
-                    <w:t>可以直接调用该</w:t>
+                    <w:t xml:space="preserve"> The </w:t>
                   </w:r>
                   <w:r>
                     <w:rPr>
@@ -1117,7 +1117,7 @@
                       <w:sz w:val="20"/>
                       <w:szCs w:val="20"/>
                     </w:rPr>
-                    <w:t>进行订单请求</w:t>
+                    <w:t xml:space="preserve"> can be called directly to submit the order</w:t>
                   </w:r>
                 </w:p>
                 <w:p>
@@ -1247,7 +1247,7 @@
         <w:rPr>
           <w:rFonts w:hint="eastAsia"/>
         </w:rPr>
-        <w:t>签名校验相关代码</w:t>
+        <w:t>Signature verification code</w:t>
       </w:r>
       <w:r>
         <w:rPr>
@@ -1265,7 +1265,7 @@
         <w:rPr>
           <w:rFonts w:hint="eastAsia"/>
         </w:rPr>
-        <w:t>可使用的接口定义</w:t>
+        <w:t>Available interface</w:t>
       </w:r>
       <w:r>
         <w:rPr>
@@ -1525,7 +1525,7 @@
                       <w:sz w:val="20"/>
                       <w:szCs w:val="20"/>
                     </w:rPr>
-                    <w:t>验证签名服务</w:t>
+                    <w:t>Signatrue verification service</w:t>
                   </w:r>
                 </w:p>
                 <w:p>
@@ -1727,7 +1727,7 @@
                       <w:sz w:val="20"/>
                       <w:szCs w:val="20"/>
                     </w:rPr>
-                    <w:t xml:space="preserve"> VerifySignatureService {</w:t>
+                    <w:t xml:space="preserve"> VerifySignatrueService {</w:t>
                   </w:r>
                 </w:p>
                 <w:p>
@@ -1840,7 +1840,7 @@
                       <w:sz w:val="20"/>
                       <w:szCs w:val="20"/>
                     </w:rPr>
-                    <w:t>验证签名是否一致</w:t>
+                    <w:t>Verify whether the signatrue matches</w:t>
                   </w:r>
                 </w:p>
                 <w:p>
@@ -1937,7 +1937,7 @@
                       <w:sz w:val="20"/>
                       <w:szCs w:val="20"/>
                     </w:rPr>
-                    <w:t>未签名的字符串</w:t>
+                    <w:t>Unsigned string</w:t>
                   </w:r>
                 </w:p>
                 <w:p>
@@ -2034,7 +2034,7 @@
                       <w:sz w:val="20"/>
                       <w:szCs w:val="20"/>
                     </w:rPr>
-                    <w:t>已经签名的字符串</w:t>
+                    <w:t>Signed string</w:t>
                   </w:r>
                 </w:p>
                 <w:p>
@@ -2131,7 +2131,7 @@
                       <w:sz w:val="20"/>
                       <w:szCs w:val="20"/>
                     </w:rPr>
-                    <w:t>验证签名一致则返回</w:t>
+                    <w:t xml:space="preserve">Return </w:t>
                   </w:r>
                   <w:r>
                     <w:rPr>
@@ -2141,7 +2141,7 @@
                       <w:sz w:val="20"/>
                       <w:szCs w:val="20"/>
                     </w:rPr>
-                    <w:t>true</w:t>
+                    <w:t>true if the signatrue matches</w:t>
                   </w:r>
                 </w:p>
                 <w:p>
@@ -2357,7 +2357,7 @@
                       <w:sz w:val="20"/>
                       <w:szCs w:val="20"/>
                     </w:rPr>
-                    <w:t>对字符串进行签名</w:t>
+                    <w:t>Sign a string</w:t>
                   </w:r>
                 </w:p>
                 <w:p>
@@ -2499,7 +2499,7 @@
                       <w:sz w:val="20"/>
                       <w:szCs w:val="20"/>
                     </w:rPr>
-                    <w:t>需要进行签名的字符串</w:t>
+                    <w:t>String to sign</w:t>
                   </w:r>
                 </w:p>
                 <w:p>
@@ -2596,7 +2596,7 @@
                       <w:sz w:val="20"/>
                       <w:szCs w:val="20"/>
                     </w:rPr>
-                    <w:t>返回签名</w:t>
+                    <w:t>Return the signatrue</w:t>
                   </w:r>
                 </w:p>
                 <w:p>
@@ -2701,56 +2701,59 @@
     <w:p/>
     <w:p/>
     <w:p>
-      <w:r>
-        <w:br/>
-      </w:r>
-      <w:r>
-        <w:rPr>
-          <w:rFonts w:hint="eastAsia"/>
-        </w:rPr>
-        <w:br/>
-      </w:r>
-      <w:r>
-        <w:rPr>
-          <w:rFonts w:hint="eastAsia"/>
-        </w:rPr>
-        <w:br/>
-      </w:r>
-      <w:r>
-        <w:rPr>
-          <w:rFonts w:hint="eastAsia"/>
-        </w:rPr>
-        <w:br/>
-      </w:r>
-      <w:r>
-        <w:rPr>
-          <w:rFonts w:hint="eastAsia"/>
-        </w:rPr>
-        <w:br/>
-      </w:r>
-      <w:r>
-        <w:rPr>
-          <w:rFonts w:hint="eastAsia"/>
-        </w:rPr>
-        <w:br/>
-      </w:r>
-      <w:r>
-        <w:rPr>
-          <w:rFonts w:hint="eastAsia"/>
-        </w:rPr>
-        <w:br/>
-      </w:r>
-      <w:r>
-        <w:rPr>
-          <w:rFonts w:hint="eastAsia"/>
-        </w:rPr>
-        <w:br/>
-      </w:r>
-      <w:r>
-        <w:rPr>
-          <w:rFonts w:hint="eastAsia"/>
-        </w:rPr>
-        <w:t>相关的开发代码片段</w:t>
+      <w:pPr>
+        <w:pageBreakBefore/>
+      </w:pPr>
+      <w:r>
+        <w:br/>
+      </w:r>
+      <w:r>
+        <w:rPr>
+          <w:rFonts w:hint="eastAsia"/>
+        </w:rPr>
+        <w:br/>
+      </w:r>
+      <w:r>
+        <w:rPr>
+          <w:rFonts w:hint="eastAsia"/>
+        </w:rPr>
+        <w:br/>
+      </w:r>
+      <w:r>
+        <w:rPr>
+          <w:rFonts w:hint="eastAsia"/>
+        </w:rPr>
+        <w:br/>
+      </w:r>
+      <w:r>
+        <w:rPr>
+          <w:rFonts w:hint="eastAsia"/>
+        </w:rPr>
+        <w:br/>
+      </w:r>
+      <w:r>
+        <w:rPr>
+          <w:rFonts w:hint="eastAsia"/>
+        </w:rPr>
+        <w:br/>
+      </w:r>
+      <w:r>
+        <w:rPr>
+          <w:rFonts w:hint="eastAsia"/>
+        </w:rPr>
+        <w:br/>
+      </w:r>
+      <w:r>
+        <w:rPr>
+          <w:rFonts w:hint="eastAsia"/>
+        </w:rPr>
+        <w:br/>
+      </w:r>
+      <w:r>
+        <w:rPr>
+          <w:rFonts w:hint="eastAsia"/>
+        </w:rPr>
+        <w:t>Example application code</w:t>
       </w:r>
     </w:p>
     <w:p/>
@@ -2786,7 +2789,7 @@
           <w:sz w:val="20"/>
           <w:szCs w:val="20"/>
         </w:rPr>
-        <w:t>可以采用单实例</w:t>
+        <w:t>A single instance may be used</w:t>
       </w:r>
       <w:r>
         <w:rPr>
@@ -2806,7 +2809,7 @@
           <w:sz w:val="20"/>
           <w:szCs w:val="20"/>
         </w:rPr>
-        <w:t>该类线程安全</w:t>
+        <w:t xml:space="preserve"> the class is thread-safe</w:t>
       </w:r>
     </w:p>
     <w:p>
@@ -2932,7 +2935,7 @@
           <w:sz w:val="20"/>
           <w:szCs w:val="20"/>
         </w:rPr>
-        <w:t>校验示例，如：需要校验的参数为</w:t>
+        <w:t>Verification example; parameters to verify are</w:t>
       </w:r>
       <w:r>
         <w:rPr>
@@ -2952,7 +2955,7 @@
           <w:sz w:val="20"/>
           <w:szCs w:val="20"/>
         </w:rPr>
-        <w:t>字段顺序请参阅相关的协议文档</w:t>
+        <w:t>see the protocol documentation for field order</w:t>
       </w:r>
       <w:r>
         <w:rPr>
@@ -3015,7 +3018,7 @@
           <w:sz w:val="20"/>
           <w:szCs w:val="20"/>
         </w:rPr>
-        <w:t>ture</w:t>
+        <w:t>true</w:t>
       </w:r>
       <w:r>
         <w:rPr>
@@ -3025,7 +3028,7 @@
           <w:sz w:val="20"/>
           <w:szCs w:val="20"/>
         </w:rPr>
-        <w:t>，说明校验通过，</w:t>
+        <w:t xml:space="preserve">, indicates success; </w:t>
       </w:r>
       <w:r>
         <w:rPr>
@@ -3045,7 +3048,7 @@
           <w:sz w:val="20"/>
           <w:szCs w:val="20"/>
         </w:rPr>
-        <w:t>校验失败。</w:t>
+        <w:t xml:space="preserve"> indicates failure.</w:t>
       </w:r>
     </w:p>
     <w:p>

</xml_diff>